<commit_message>
Updated manuscript with new values after eliminating sentence-final words from analysis in Exp 1
</commit_message>
<xml_diff>
--- a/manuscript/manuscript_gaussian.docx
+++ b/manuscript/manuscript_gaussian.docx
@@ -2016,7 +2016,7 @@
         </m:r>
       </m:oMath>
       <w:r>
-        <w:t xml:space="preserve">). Importantly, the Frequency × Tracker interaction was not credibly different from 0 (FFD:</w:t>
+        <w:t xml:space="preserve">). This is likely due to a systematic difference in the saccade and fixation detection algorithms. Importantly, the Frequency × Tracker interaction was not credibly different from 0 (FFD:</w:t>
       </w:r>
       <w:r>
         <w:t xml:space="preserve"> </w:t>
@@ -5202,7 +5202,7 @@
         <w:t xml:space="preserve"> </w:t>
       </w:r>
       <w:r>
-        <w:t xml:space="preserve">package. We found consistent evidence for the frequency effect in all measures for the Eyelink and the Webcam in FFD (Eyelink:</w:t>
+        <w:t xml:space="preserve">package. We found consistent evidence for the frequency effect in all measures for the Eyelink and the Webcam in SFD (Eyelink:</w:t>
       </w:r>
       <w:r>
         <w:t xml:space="preserve"> </w:t>
@@ -5234,7 +5234,7 @@
         <w:t xml:space="preserve"> </w:t>
       </w:r>
       <w:r>
-        <w:t xml:space="preserve">= [-0.07, -0.02]; Webcam:</w:t>
+        <w:t xml:space="preserve">= [-0.08, -0.02]; Webcam:</w:t>
       </w:r>
       <w:r>
         <w:t xml:space="preserve"> </w:t>
@@ -5250,7 +5250,7 @@
         <w:t xml:space="preserve"> </w:t>
       </w:r>
       <w:r>
-        <w:t xml:space="preserve">= -0.03 95%</w:t>
+        <w:t xml:space="preserve">= -0.04 95%</w:t>
       </w:r>
       <w:r>
         <w:t xml:space="preserve"> </w:t>
@@ -5266,7 +5266,7 @@
         <w:t xml:space="preserve"> </w:t>
       </w:r>
       <w:r>
-        <w:t xml:space="preserve">= [-0.06, 0.00]), SFD (Eyelink:</w:t>
+        <w:t xml:space="preserve">= [-0.07, -0.01]), and GD (Eyelink:</w:t>
       </w:r>
       <w:r>
         <w:t xml:space="preserve"> </w:t>
@@ -5282,7 +5282,7 @@
         <w:t xml:space="preserve"> </w:t>
       </w:r>
       <w:r>
-        <w:t xml:space="preserve">= -0.05 95%</w:t>
+        <w:t xml:space="preserve">= -0.07 95%</w:t>
       </w:r>
       <w:r>
         <w:t xml:space="preserve"> </w:t>
@@ -5298,7 +5298,7 @@
         <w:t xml:space="preserve"> </w:t>
       </w:r>
       <w:r>
-        <w:t xml:space="preserve">= [-0.08, -0.02]; Webcam:</w:t>
+        <w:t xml:space="preserve">= [-0.10, -0.04]; Webcam:</w:t>
       </w:r>
       <w:r>
         <w:t xml:space="preserve"> </w:t>
@@ -5314,7 +5314,7 @@
         <w:t xml:space="preserve"> </w:t>
       </w:r>
       <w:r>
-        <w:t xml:space="preserve">= -0.04 95%</w:t>
+        <w:t xml:space="preserve">= -0.06 95%</w:t>
       </w:r>
       <w:r>
         <w:t xml:space="preserve"> </w:t>
@@ -5330,7 +5330,7 @@
         <w:t xml:space="preserve"> </w:t>
       </w:r>
       <w:r>
-        <w:t xml:space="preserve">= [-0.07, -0.01]), and GD (Eyelink:</w:t>
+        <w:t xml:space="preserve">= [-0.10, -0.03]). In FFD (Eyelink:</w:t>
       </w:r>
       <w:r>
         <w:t xml:space="preserve"> </w:t>
@@ -5346,7 +5346,7 @@
         <w:t xml:space="preserve"> </w:t>
       </w:r>
       <w:r>
-        <w:t xml:space="preserve">= -0.07 95%</w:t>
+        <w:t xml:space="preserve">= -0.05 95%</w:t>
       </w:r>
       <w:r>
         <w:t xml:space="preserve"> </w:t>
@@ -5362,7 +5362,7 @@
         <w:t xml:space="preserve"> </w:t>
       </w:r>
       <w:r>
-        <w:t xml:space="preserve">= [-0.10, -0.04]; Webcam:</w:t>
+        <w:t xml:space="preserve">= [-0.07, -0.02]; Webcam:</w:t>
       </w:r>
       <w:r>
         <w:t xml:space="preserve"> </w:t>
@@ -5378,7 +5378,7 @@
         <w:t xml:space="preserve"> </w:t>
       </w:r>
       <w:r>
-        <w:t xml:space="preserve">= -0.06 95%</w:t>
+        <w:t xml:space="preserve">= -0.03 95%</w:t>
       </w:r>
       <w:r>
         <w:t xml:space="preserve"> </w:t>
@@ -5394,7 +5394,7 @@
         <w:t xml:space="preserve"> </w:t>
       </w:r>
       <w:r>
-        <w:t xml:space="preserve">= [-0.10, -0.03]). In TVT, the 95% CI for the Webcam data narrowly included 0 (Eyelink:</w:t>
+        <w:t xml:space="preserve">= [-0.06, 0.00]), and TVT (Eyelink:</w:t>
       </w:r>
       <w:r>
         <w:t xml:space="preserve"> </w:t>
@@ -5458,7 +5458,7 @@
         <w:t xml:space="preserve"> </w:t>
       </w:r>
       <w:r>
-        <w:t xml:space="preserve">= [-0.09, 0.00]). This demonstrates that, when there is sufficient data, the frequency effect can be detected even in the noisier Webcam data.</w:t>
+        <w:t xml:space="preserve">= [-0.09, 0.00]), the 95% CI for the Webcam data narrowly included 0. Overall, this demonstrates that, when there is sufficient data, the frequency effect can be detected even in the noisier Webcam data.</w:t>
       </w:r>
     </w:p>
     <w:bookmarkEnd w:id="38"/>
@@ -12491,7 +12491,7 @@
         <w:pStyle w:val="Caption"/>
       </w:pPr>
       <w:r>
-        <w:t xml:space="preserve">Coefficient estimates and 95% credible intervals (in square brackets) from Bayesian linear mixed models fitted to first fixation duration (FFD), single fixation duration (SFD), gaze duration (GD), and total viewing time (TVT) on target words in Experiment 1 (Gaussian models).</w:t>
+        <w:t xml:space="preserve">Coefficient estimates and 95% credible intervals (in square brackets) from Bayesian linear mixed models fitted to first fixation duration (FFD), single fixation duration (SFD), gaze duration (GD), and total viewing time (TVT) on target words in Experiment 1.</w:t>
       </w:r>
     </w:p>
     <w:tbl xmlns:w="http://schemas.openxmlformats.org/wordprocessingml/2006/main" xmlns:wp="http://schemas.openxmlformats.org/drawingml/2006/wordprocessingDrawing" xmlns:r="http://schemas.openxmlformats.org/officeDocument/2006/relationships" xmlns:w14="http://schemas.microsoft.com/office/word/2010/wordml">
@@ -13837,7 +13837,7 @@
         <w:pStyle w:val="Caption"/>
       </w:pPr>
       <w:r>
-        <w:t xml:space="preserve">Coefficient estimates and 95% credible intervals (in square brackets) from Bayesian linear mixed models fitted to first fixation duration (FFD), single fixation duration (SFD), gaze duration (GD), and total viewing time (TVT) on all words (except for the first and last in each sentence) in Experiment 1 (Gaussian models).</w:t>
+        <w:t xml:space="preserve">Coefficient estimates and 95% credible intervals (in square brackets) from Bayesian linear mixed models fitted to first fixation duration (FFD), single fixation duration (SFD), gaze duration (GD), and total viewing time (TVT) on all words (except for the first and last in each sentence) in Experiment 1.</w:t>
       </w:r>
     </w:p>
     <w:tbl xmlns:w="http://schemas.openxmlformats.org/wordprocessingml/2006/main" xmlns:wp="http://schemas.openxmlformats.org/drawingml/2006/wordprocessingDrawing" xmlns:r="http://schemas.openxmlformats.org/officeDocument/2006/relationships" xmlns:w14="http://schemas.microsoft.com/office/word/2010/wordml">
@@ -16647,7 +16647,7 @@
         <w:pStyle w:val="Caption"/>
       </w:pPr>
       <w:r>
-        <w:t xml:space="preserve">Coefficient estimates and 95% credible intervals (in square brackets) from Bayesian linear mixed models fitted to first fixation duration (FFD), single fixation duration (SFD), gaze duration (GD), and total viewing time (TVT) on target words in Experiment 3 (Gaussian models).</w:t>
+        <w:t xml:space="preserve">Coefficient estimates and 95% credible intervals (in square brackets) from Bayesian linear mixed models fitted to first fixation duration (FFD), single fixation duration (SFD), gaze duration (GD), and total viewing time (TVT) on target words in Experiment 3.</w:t>
       </w:r>
     </w:p>
     <w:tbl xmlns:w="http://schemas.openxmlformats.org/wordprocessingml/2006/main" xmlns:wp="http://schemas.openxmlformats.org/drawingml/2006/wordprocessingDrawing" xmlns:r="http://schemas.openxmlformats.org/officeDocument/2006/relationships" xmlns:w14="http://schemas.microsoft.com/office/word/2010/wordml">
@@ -17993,7 +17993,7 @@
         <w:pStyle w:val="Caption"/>
       </w:pPr>
       <w:r>
-        <w:t xml:space="preserve">Coefficient estimates and 95% credible intervals (in square brackets) from Bayesian linear mixed models fitted to first fixation duration (FFD), single fixation duration (SFD), gaze duration (GD), and total viewing time (TVT) on all words (except for the first and last in each sentence) in Experiment 3 (Gaussian models).</w:t>
+        <w:t xml:space="preserve">Coefficient estimates and 95% credible intervals (in square brackets) from Bayesian linear mixed models fitted to first fixation duration (FFD), single fixation duration (SFD), gaze duration (GD), and total viewing time (TVT) on all words (except for the first and last in each sentence) in Experiment 3.</w:t>
       </w:r>
     </w:p>
     <w:tbl xmlns:w="http://schemas.openxmlformats.org/wordprocessingml/2006/main" xmlns:wp="http://schemas.openxmlformats.org/drawingml/2006/wordprocessingDrawing" xmlns:r="http://schemas.openxmlformats.org/officeDocument/2006/relationships" xmlns:w14="http://schemas.microsoft.com/office/word/2010/wordml">

</xml_diff>

<commit_message>
Write up Exp 2 in manuscript (docx and pdf)
</commit_message>
<xml_diff>
--- a/manuscript/manuscript_gaussian.docx
+++ b/manuscript/manuscript_gaussian.docx
@@ -4476,10 +4476,7 @@
         </m:r>
       </m:oMath>
       <w:r>
-        <w:t xml:space="preserve">). There were no credible Frequency × Tracker interactions (FFD:</w:t>
-      </w:r>
-      <w:r>
-        <w:t xml:space="preserve"> </w:t>
+        <w:t xml:space="preserve">). There were small, but credible Frequency × Tracker interactions in FFD (</w:t>
       </w:r>
       <m:oMath>
         <m:r>
@@ -4650,10 +4647,7 @@
         </m:r>
       </m:oMath>
       <w:r>
-        <w:t xml:space="preserve">; SFD:</w:t>
-      </w:r>
-      <w:r>
-        <w:t xml:space="preserve"> </w:t>
+        <w:t xml:space="preserve">), SFD (</w:t>
       </w:r>
       <m:oMath>
         <m:r>
@@ -4824,10 +4818,7 @@
         </m:r>
       </m:oMath>
       <w:r>
-        <w:t xml:space="preserve">; GD:</w:t>
-      </w:r>
-      <w:r>
-        <w:t xml:space="preserve"> </w:t>
+        <w:t xml:space="preserve">), GD (</w:t>
       </w:r>
       <m:oMath>
         <m:r>
@@ -5004,10 +4995,7 @@
         </m:r>
       </m:oMath>
       <w:r>
-        <w:t xml:space="preserve">; TVT:</w:t>
-      </w:r>
-      <w:r>
-        <w:t xml:space="preserve"> </w:t>
+        <w:t xml:space="preserve">), and TVT (</w:t>
       </w:r>
       <m:oMath>
         <m:r>
@@ -5178,7 +5166,7 @@
         </m:r>
       </m:oMath>
       <w:r>
-        <w:t xml:space="preserve">). To present the frequency slope within each device directly, we summarized the Zipf effect (slope) by tracker using</w:t>
+        <w:t xml:space="preserve">), indicating that the frequency effect was stronger in the Eyelink data compared to the Webcam data. In order to show the marginal effect of zipf frequency within each device directly, we summarized the slope of the zipf effect using</w:t>
       </w:r>
       <w:r>
         <w:t xml:space="preserve"> </w:t>
@@ -5208,7 +5196,7 @@
         <w:t xml:space="preserve"> </w:t>
       </w:r>
       <w:r>
-        <w:t xml:space="preserve">package. We found consistent evidence for the frequency effect in all measures for the Eyelink and the Webcam in SFD (Eyelink:</w:t>
+        <w:t xml:space="preserve">package. We found consistent evidence for the frequency effect in all measures for both the Eyelink and the Webcam (FFD: Eyelink:</w:t>
       </w:r>
       <w:r>
         <w:t xml:space="preserve"> </w:t>
@@ -5240,7 +5228,7 @@
         <w:t xml:space="preserve"> </w:t>
       </w:r>
       <w:r>
-        <w:t xml:space="preserve">= [-0.08, -0.01]; Webcam:</w:t>
+        <w:t xml:space="preserve">= [-0.07, -0.01]; Webcam:</w:t>
       </w:r>
       <w:r>
         <w:t xml:space="preserve"> </w:t>
@@ -5256,7 +5244,7 @@
         <w:t xml:space="preserve"> </w:t>
       </w:r>
       <w:r>
-        <w:t xml:space="preserve">= -0.04 95%</w:t>
+        <w:t xml:space="preserve">= -0.03 95%</w:t>
       </w:r>
       <w:r>
         <w:t xml:space="preserve"> </w:t>
@@ -5272,7 +5260,7 @@
         <w:t xml:space="preserve"> </w:t>
       </w:r>
       <w:r>
-        <w:t xml:space="preserve">= [-0.07, -0.00]), and GD (Eyelink:</w:t>
+        <w:t xml:space="preserve">= [-0.06, 0.01], SFD: Eyelink:</w:t>
       </w:r>
       <w:r>
         <w:t xml:space="preserve"> </w:t>
@@ -5288,7 +5276,7 @@
         <w:t xml:space="preserve"> </w:t>
       </w:r>
       <w:r>
-        <w:t xml:space="preserve">= -0.07 95%</w:t>
+        <w:t xml:space="preserve">= -0.04 95%</w:t>
       </w:r>
       <w:r>
         <w:t xml:space="preserve"> </w:t>
@@ -5304,7 +5292,7 @@
         <w:t xml:space="preserve"> </w:t>
       </w:r>
       <w:r>
-        <w:t xml:space="preserve">= [-0.11, -0.03]; Webcam:</w:t>
+        <w:t xml:space="preserve">= [-0.08, -0.01]; Webcam:</w:t>
       </w:r>
       <w:r>
         <w:t xml:space="preserve"> </w:t>
@@ -5320,7 +5308,7 @@
         <w:t xml:space="preserve"> </w:t>
       </w:r>
       <w:r>
-        <w:t xml:space="preserve">= -0.07 95%</w:t>
+        <w:t xml:space="preserve">= -0.04 95%</w:t>
       </w:r>
       <w:r>
         <w:t xml:space="preserve"> </w:t>
@@ -5336,7 +5324,7 @@
         <w:t xml:space="preserve"> </w:t>
       </w:r>
       <w:r>
-        <w:t xml:space="preserve">= [-0.11, -0.03]). In FFD (Eyelink:</w:t>
+        <w:t xml:space="preserve">= [-0.07, -0.00], GD: Eyelink:</w:t>
       </w:r>
       <w:r>
         <w:t xml:space="preserve"> </w:t>
@@ -5352,7 +5340,7 @@
         <w:t xml:space="preserve"> </w:t>
       </w:r>
       <w:r>
-        <w:t xml:space="preserve">= -0.04 95%</w:t>
+        <w:t xml:space="preserve">= -0.07 95%</w:t>
       </w:r>
       <w:r>
         <w:t xml:space="preserve"> </w:t>
@@ -5368,7 +5356,7 @@
         <w:t xml:space="preserve"> </w:t>
       </w:r>
       <w:r>
-        <w:t xml:space="preserve">= [-0.07, -0.01]; Webcam:</w:t>
+        <w:t xml:space="preserve">= [-0.11, -0.03]; Webcam:</w:t>
       </w:r>
       <w:r>
         <w:t xml:space="preserve"> </w:t>
@@ -5384,7 +5372,7 @@
         <w:t xml:space="preserve"> </w:t>
       </w:r>
       <w:r>
-        <w:t xml:space="preserve">= -0.03 95%</w:t>
+        <w:t xml:space="preserve">= -0.07 95%</w:t>
       </w:r>
       <w:r>
         <w:t xml:space="preserve"> </w:t>
@@ -5400,7 +5388,7 @@
         <w:t xml:space="preserve"> </w:t>
       </w:r>
       <w:r>
-        <w:t xml:space="preserve">= [-0.06, 0.01]), and TVT (Eyelink:</w:t>
+        <w:t xml:space="preserve">= [-0.11, -0.03], TVT: Eyelink:</w:t>
       </w:r>
       <w:r>
         <w:t xml:space="preserve"> </w:t>
@@ -5464,7 +5452,13 @@
         <w:t xml:space="preserve"> </w:t>
       </w:r>
       <w:r>
-        <w:t xml:space="preserve">= [-0.12, -0.04]), the 95% CI for the Webcam data narrowly included 0. Overall, this demonstrates that, when there is sufficient data, the frequency effect can be detected even in the noisier Webcam data.</w:t>
+        <w:t xml:space="preserve">= [-0.12, -0.04]).</w:t>
+      </w:r>
+      <w:r>
+        <w:t xml:space="preserve"> </w:t>
+      </w:r>
+      <w:r>
+        <w:t xml:space="preserve">Overall, this demonstrates that, when there is sufficient data, the frequency effect can be detected even in the noisier Webcam data.</w:t>
       </w:r>
     </w:p>
     <w:bookmarkEnd w:id="38"/>
@@ -11027,7 +11021,7 @@
         </m:r>
       </m:oMath>
       <w:r>
-        <w:t xml:space="preserve">). There was no evidence for an interaction between Zipf frequency and tracker in FFD (</w:t>
+        <w:t xml:space="preserve">). There was no credible evidence for an interaction between Zipf frequency and tracker in FFD (</w:t>
       </w:r>
       <m:oMath>
         <m:r>

</xml_diff>